<commit_message>
Update README and add latest report PDF
</commit_message>
<xml_diff>
--- a/Documentation/Report.docx
+++ b/Documentation/Report.docx
@@ -9,6 +9,7 @@
           <w:rFonts w:ascii="Times New Roman" w:hAnsi="Times New Roman" w:cs="Times New Roman"/>
         </w:rPr>
       </w:pPr>
+      <w:bookmarkStart w:id="0" w:name="_GoBack"/>
       <w:r>
         <w:rPr>
           <w:rStyle w:val="Strong"/>
@@ -123,10 +124,7 @@
     </w:p>
     <w:p>
       <w:r>
-        <w:t>During the first days of working, I came along a Dataset named HEAR dataset</w:t>
-      </w:r>
-      <w:r>
-        <w:t xml:space="preserve">. The project uses a dataset of </w:t>
+        <w:t xml:space="preserve">During the first days of working, I came along a Dataset named HEAR dataset. The project uses a dataset of </w:t>
       </w:r>
       <w:r>
         <w:rPr>
@@ -268,55 +266,7 @@
           <w:b w:val="0"/>
           <w:bCs w:val="0"/>
         </w:rPr>
-        <w:t xml:space="preserve">This </w:t>
-      </w:r>
-      <w:r>
-        <w:rPr>
-          <w:rStyle w:val="Strong"/>
-          <w:b w:val="0"/>
-          <w:bCs w:val="0"/>
-        </w:rPr>
-        <w:t>mixed classification-sentiment approach</w:t>
-      </w:r>
-      <w:r>
-        <w:rPr>
-          <w:rStyle w:val="Strong"/>
-          <w:b w:val="0"/>
-          <w:bCs w:val="0"/>
-        </w:rPr>
-        <w:t xml:space="preserve"> allows the model to identify </w:t>
-      </w:r>
-      <w:r>
-        <w:rPr>
-          <w:rStyle w:val="Strong"/>
-          <w:b w:val="0"/>
-          <w:bCs w:val="0"/>
-        </w:rPr>
-        <w:t>which aspects are discussed</w:t>
-      </w:r>
-      <w:r>
-        <w:rPr>
-          <w:rStyle w:val="Strong"/>
-          <w:b w:val="0"/>
-          <w:bCs w:val="0"/>
-        </w:rPr>
-        <w:t xml:space="preserve"> and </w:t>
-      </w:r>
-      <w:r>
-        <w:rPr>
-          <w:rStyle w:val="Strong"/>
-          <w:b w:val="0"/>
-          <w:bCs w:val="0"/>
-        </w:rPr>
-        <w:t>how the patient feels about each</w:t>
-      </w:r>
-      <w:r>
-        <w:rPr>
-          <w:rStyle w:val="Strong"/>
-          <w:b w:val="0"/>
-          <w:bCs w:val="0"/>
-        </w:rPr>
-        <w:t xml:space="preserve">, in a single pass. Additional fields like doctor name, department, and </w:t>
+        <w:t xml:space="preserve">This mixed classification-sentiment approach allows the model to identify which aspects are discussed and how the patient feels about each, in a single pass. Additional fields like doctor name, department, and </w:t>
       </w:r>
       <w:r>
         <w:rPr>
@@ -325,23 +275,7 @@
           <w:bCs w:val="0"/>
         </w:rPr>
         <w:lastRenderedPageBreak/>
-        <w:t xml:space="preserve">hospital location are included to support filtering and further analysis. The data is preprocessed for Arabic tokenization and split into training, validation, and test sets to ensure </w:t>
-      </w:r>
-      <w:r>
-        <w:rPr>
-          <w:rStyle w:val="Strong"/>
-          <w:b w:val="0"/>
-          <w:bCs w:val="0"/>
-        </w:rPr>
-        <w:t>reliable model evaluation</w:t>
-      </w:r>
-      <w:r>
-        <w:rPr>
-          <w:rStyle w:val="Strong"/>
-          <w:b w:val="0"/>
-          <w:bCs w:val="0"/>
-        </w:rPr>
-        <w:t>.</w:t>
+        <w:t>hospital location are included to support filtering and further analysis. The data is preprocessed for Arabic tokenization and split into training, validation, and test sets to ensure reliable model evaluation.</w:t>
       </w:r>
     </w:p>
     <w:p>
@@ -451,7 +385,7 @@
         <mc:AlternateContent>
           <mc:Choice Requires="wps">
             <w:drawing>
-              <wp:anchor distT="0" distB="0" distL="114300" distR="114300" simplePos="0" relativeHeight="251661312" behindDoc="0" locked="0" layoutInCell="1" allowOverlap="1" wp14:anchorId="613D4A5D" wp14:editId="075ABAC3">
+              <wp:anchor distT="0" distB="0" distL="114300" distR="114300" simplePos="0" relativeHeight="251661312" behindDoc="0" locked="0" layoutInCell="1" allowOverlap="1" wp14:anchorId="5E040B9A" wp14:editId="5C3DEB82">
                 <wp:simplePos x="0" y="0"/>
                 <wp:positionH relativeFrom="margin">
                   <wp:align>center</wp:align>
@@ -530,7 +464,7 @@
           </mc:Choice>
           <mc:Fallback>
             <w:pict>
-              <v:shapetype w14:anchorId="613D4A5D" id="_x0000_t202" coordsize="21600,21600" o:spt="202" path="m,l,21600r21600,l21600,xe">
+              <v:shapetype w14:anchorId="5E040B9A" id="_x0000_t202" coordsize="21600,21600" o:spt="202" path="m,l,21600r21600,l21600,xe">
                 <v:stroke joinstyle="miter"/>
                 <v:path gradientshapeok="t" o:connecttype="rect"/>
               </v:shapetype>
@@ -579,7 +513,7 @@
           <w:noProof/>
         </w:rPr>
         <w:drawing>
-          <wp:anchor distT="0" distB="0" distL="114300" distR="114300" simplePos="0" relativeHeight="251659264" behindDoc="0" locked="0" layoutInCell="1" allowOverlap="1">
+          <wp:anchor distT="0" distB="0" distL="114300" distR="114300" simplePos="0" relativeHeight="251660288" behindDoc="0" locked="0" layoutInCell="1" allowOverlap="1" wp14:anchorId="4E80CEE4" wp14:editId="3E8DD38D">
             <wp:simplePos x="0" y="0"/>
             <wp:positionH relativeFrom="margin">
               <wp:align>center</wp:align>
@@ -653,7 +587,7 @@
         <mc:AlternateContent>
           <mc:Choice Requires="wps">
             <w:drawing>
-              <wp:anchor distT="0" distB="0" distL="114300" distR="114300" simplePos="0" relativeHeight="251663360" behindDoc="0" locked="0" layoutInCell="1" allowOverlap="1" wp14:anchorId="33789CA3" wp14:editId="351DDFB9">
+              <wp:anchor distT="0" distB="0" distL="114300" distR="114300" simplePos="0" relativeHeight="251662336" behindDoc="0" locked="0" layoutInCell="1" allowOverlap="1" wp14:anchorId="61F99014" wp14:editId="3E193086">
                 <wp:simplePos x="0" y="0"/>
                 <wp:positionH relativeFrom="column">
                   <wp:posOffset>4643755</wp:posOffset>
@@ -745,7 +679,7 @@
           </mc:Choice>
           <mc:Fallback>
             <w:pict>
-              <v:shape w14:anchorId="33789CA3" id="Text Box 4" o:spid="_x0000_s1027" type="#_x0000_t202" style="position:absolute;margin-left:365.65pt;margin-top:366.2pt;width:102.35pt;height:.05pt;z-index:251663360;visibility:visible;mso-wrap-style:square;mso-wrap-distance-left:9pt;mso-wrap-distance-top:0;mso-wrap-distance-right:9pt;mso-wrap-distance-bottom:0;mso-position-horizontal:absolute;mso-position-horizontal-relative:text;mso-position-vertical:absolute;mso-position-vertical-relative:text;v-text-anchor:top" o:gfxdata="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" stroked="f">
+              <v:shape w14:anchorId="61F99014" id="Text Box 4" o:spid="_x0000_s1027" type="#_x0000_t202" style="position:absolute;margin-left:365.65pt;margin-top:366.2pt;width:102.35pt;height:.05pt;z-index:251662336;visibility:visible;mso-wrap-style:square;mso-wrap-distance-left:9pt;mso-wrap-distance-top:0;mso-wrap-distance-right:9pt;mso-wrap-distance-bottom:0;mso-position-horizontal:absolute;mso-position-horizontal-relative:text;mso-position-vertical:absolute;mso-position-vertical-relative:text;v-text-anchor:top" o:gfxdata="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" stroked="f">
                 <v:textbox style="mso-fit-shape-to-text:t" inset="0,0,0,0">
                   <w:txbxContent>
                     <w:p>
@@ -806,7 +740,7 @@
           <w:lang w:bidi="ar-LB"/>
         </w:rPr>
         <w:drawing>
-          <wp:anchor distT="0" distB="0" distL="114300" distR="114300" simplePos="0" relativeHeight="251658240" behindDoc="0" locked="0" layoutInCell="1" allowOverlap="1">
+          <wp:anchor distT="0" distB="0" distL="114300" distR="114300" simplePos="0" relativeHeight="251659264" behindDoc="0" locked="0" layoutInCell="1" allowOverlap="1" wp14:anchorId="676755AD" wp14:editId="024EB541">
             <wp:simplePos x="0" y="0"/>
             <wp:positionH relativeFrom="margin">
               <wp:align>right</wp:align>
@@ -1054,7 +988,7 @@
         <mc:AlternateContent>
           <mc:Choice Requires="wps">
             <w:drawing>
-              <wp:anchor distT="0" distB="0" distL="114300" distR="114300" simplePos="0" relativeHeight="251666432" behindDoc="0" locked="0" layoutInCell="1" allowOverlap="1" wp14:anchorId="199A899F" wp14:editId="589E4CE9">
+              <wp:anchor distT="0" distB="0" distL="114300" distR="114300" simplePos="0" relativeHeight="251664384" behindDoc="0" locked="0" layoutInCell="1" allowOverlap="1" wp14:anchorId="208C2534" wp14:editId="3B7C0446">
                 <wp:simplePos x="0" y="0"/>
                 <wp:positionH relativeFrom="margin">
                   <wp:align>right</wp:align>
@@ -1133,7 +1067,7 @@
           </mc:Choice>
           <mc:Fallback>
             <w:pict>
-              <v:shape w14:anchorId="199A899F" id="Text Box 7" o:spid="_x0000_s1028" type="#_x0000_t202" style="position:absolute;margin-left:416.8pt;margin-top:325pt;width:468pt;height:.05pt;z-index:251666432;visibility:visible;mso-wrap-style:square;mso-wrap-distance-left:9pt;mso-wrap-distance-top:0;mso-wrap-distance-right:9pt;mso-wrap-distance-bottom:0;mso-position-horizontal:right;mso-position-horizontal-relative:margin;mso-position-vertical:absolute;mso-position-vertical-relative:text;v-text-anchor:top" o:gfxdata="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" stroked="f">
+              <v:shape w14:anchorId="208C2534" id="Text Box 7" o:spid="_x0000_s1028" type="#_x0000_t202" style="position:absolute;margin-left:416.8pt;margin-top:325pt;width:468pt;height:.05pt;z-index:251664384;visibility:visible;mso-wrap-style:square;mso-wrap-distance-left:9pt;mso-wrap-distance-top:0;mso-wrap-distance-right:9pt;mso-wrap-distance-bottom:0;mso-position-horizontal:right;mso-position-horizontal-relative:margin;mso-position-vertical:absolute;mso-position-vertical-relative:text;v-text-anchor:top" o:gfxdata="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" stroked="f">
                 <v:textbox style="mso-fit-shape-to-text:t" inset="0,0,0,0">
                   <w:txbxContent>
                     <w:p>
@@ -1178,7 +1112,7 @@
           <w:noProof/>
         </w:rPr>
         <w:drawing>
-          <wp:anchor distT="0" distB="0" distL="114300" distR="114300" simplePos="0" relativeHeight="251664384" behindDoc="0" locked="0" layoutInCell="1" allowOverlap="1">
+          <wp:anchor distT="0" distB="0" distL="114300" distR="114300" simplePos="0" relativeHeight="251663360" behindDoc="0" locked="0" layoutInCell="1" allowOverlap="1" wp14:anchorId="1FBCCDBE" wp14:editId="292DC379">
             <wp:simplePos x="0" y="0"/>
             <wp:positionH relativeFrom="margin">
               <wp:align>right</wp:align>
@@ -2473,7 +2407,7 @@
         <mc:AlternateContent>
           <mc:Choice Requires="wps">
             <w:drawing>
-              <wp:anchor distT="0" distB="0" distL="114300" distR="114300" simplePos="0" relativeHeight="251669504" behindDoc="0" locked="0" layoutInCell="1" allowOverlap="1" wp14:anchorId="52B875A5" wp14:editId="0986256B">
+              <wp:anchor distT="0" distB="0" distL="114300" distR="114300" simplePos="0" relativeHeight="251666432" behindDoc="0" locked="0" layoutInCell="1" allowOverlap="1" wp14:anchorId="5BB0BD71" wp14:editId="266072A4">
                 <wp:simplePos x="0" y="0"/>
                 <wp:positionH relativeFrom="margin">
                   <wp:align>center</wp:align>
@@ -2558,7 +2492,7 @@
           </mc:Choice>
           <mc:Fallback>
             <w:pict>
-              <v:shape w14:anchorId="52B875A5" id="Text Box 8" o:spid="_x0000_s1029" type="#_x0000_t202" style="position:absolute;margin-left:0;margin-top:220.3pt;width:5in;height:.05pt;z-index:251669504;visibility:visible;mso-wrap-style:square;mso-wrap-distance-left:9pt;mso-wrap-distance-top:0;mso-wrap-distance-right:9pt;mso-wrap-distance-bottom:0;mso-position-horizontal:center;mso-position-horizontal-relative:margin;mso-position-vertical:absolute;mso-position-vertical-relative:text;v-text-anchor:top" o:gfxdata="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" stroked="f">
+              <v:shape w14:anchorId="5BB0BD71" id="Text Box 8" o:spid="_x0000_s1029" type="#_x0000_t202" style="position:absolute;margin-left:0;margin-top:220.3pt;width:5in;height:.05pt;z-index:251666432;visibility:visible;mso-wrap-style:square;mso-wrap-distance-left:9pt;mso-wrap-distance-top:0;mso-wrap-distance-right:9pt;mso-wrap-distance-bottom:0;mso-position-horizontal:center;mso-position-horizontal-relative:margin;mso-position-vertical:absolute;mso-position-vertical-relative:text;v-text-anchor:top" o:gfxdata="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" stroked="f">
                 <v:textbox style="mso-fit-shape-to-text:t" inset="0,0,0,0">
                   <w:txbxContent>
                     <w:p>
@@ -2609,7 +2543,7 @@
           <w:noProof/>
         </w:rPr>
         <w:drawing>
-          <wp:anchor distT="0" distB="0" distL="114300" distR="114300" simplePos="0" relativeHeight="251667456" behindDoc="0" locked="0" layoutInCell="1" allowOverlap="1" wp14:anchorId="5412CDE9">
+          <wp:anchor distT="0" distB="0" distL="114300" distR="114300" simplePos="0" relativeHeight="251665408" behindDoc="0" locked="0" layoutInCell="1" allowOverlap="1" wp14:anchorId="5D1AC835" wp14:editId="677F6FCB">
             <wp:simplePos x="0" y="0"/>
             <wp:positionH relativeFrom="margin">
               <wp:align>center</wp:align>
@@ -3745,7 +3679,7 @@
         </w:rPr>
         <w:lastRenderedPageBreak/>
         <w:drawing>
-          <wp:anchor distT="0" distB="0" distL="114300" distR="114300" simplePos="0" relativeHeight="251671552" behindDoc="0" locked="0" layoutInCell="1" allowOverlap="1" wp14:anchorId="5013ED6D" wp14:editId="27883E06">
+          <wp:anchor distT="0" distB="0" distL="114300" distR="114300" simplePos="0" relativeHeight="251667456" behindDoc="0" locked="0" layoutInCell="1" allowOverlap="1" wp14:anchorId="1EF0B715" wp14:editId="13AC6F88">
             <wp:simplePos x="0" y="0"/>
             <wp:positionH relativeFrom="margin">
               <wp:align>center</wp:align>
@@ -4614,7 +4548,7 @@
         </w:rPr>
         <w:lastRenderedPageBreak/>
         <w:drawing>
-          <wp:anchor distT="0" distB="0" distL="114300" distR="114300" simplePos="0" relativeHeight="251673600" behindDoc="0" locked="0" layoutInCell="1" allowOverlap="1" wp14:anchorId="5F08590F">
+          <wp:anchor distT="0" distB="0" distL="114300" distR="114300" simplePos="0" relativeHeight="251669504" behindDoc="0" locked="0" layoutInCell="1" allowOverlap="1" wp14:anchorId="593F7225" wp14:editId="720AE90E">
             <wp:simplePos x="0" y="0"/>
             <wp:positionH relativeFrom="margin">
               <wp:posOffset>689610</wp:posOffset>
@@ -4652,7 +4586,7 @@
           <w:noProof/>
         </w:rPr>
         <w:drawing>
-          <wp:anchor distT="0" distB="0" distL="114300" distR="114300" simplePos="0" relativeHeight="251672576" behindDoc="0" locked="0" layoutInCell="1" allowOverlap="1" wp14:anchorId="0986F75A">
+          <wp:anchor distT="0" distB="0" distL="114300" distR="114300" simplePos="0" relativeHeight="251668480" behindDoc="0" locked="0" layoutInCell="1" allowOverlap="1" wp14:anchorId="279BA258" wp14:editId="18AFBEF2">
             <wp:simplePos x="0" y="0"/>
             <wp:positionH relativeFrom="margin">
               <wp:align>center</wp:align>
@@ -4695,10 +4629,7 @@
         </w:rPr>
       </w:pPr>
       <w:r>
-        <w:t xml:space="preserve">The scripts for the </w:t>
-      </w:r>
-      <w:r>
-        <w:t xml:space="preserve">training the models and Testing them are present on </w:t>
+        <w:t xml:space="preserve">The scripts for the training the models and Testing them are present on </w:t>
       </w:r>
       <w:hyperlink r:id="rId15" w:history="1">
         <w:r>
@@ -4723,10 +4654,7 @@
         <w:t>NER</w:t>
       </w:r>
       <w:r>
-        <w:t xml:space="preserve"> </w:t>
-      </w:r>
-      <w:r>
-        <w:t>Model</w:t>
+        <w:t xml:space="preserve"> Model</w:t>
       </w:r>
       <w:r>
         <w:t>: GLiNER</w:t>
@@ -4745,10 +4673,7 @@
         <w:t>STT</w:t>
       </w:r>
       <w:r>
-        <w:t xml:space="preserve"> </w:t>
-      </w:r>
-      <w:r>
-        <w:t>Model</w:t>
+        <w:t xml:space="preserve"> Model</w:t>
       </w:r>
       <w:r>
         <w:t>: Wisper</w:t>
@@ -4761,7 +4686,7 @@
         </w:rPr>
         <w:lastRenderedPageBreak/>
         <w:drawing>
-          <wp:anchor distT="0" distB="0" distL="114300" distR="114300" simplePos="0" relativeHeight="251674624" behindDoc="0" locked="0" layoutInCell="1" allowOverlap="1" wp14:anchorId="71C8D0EC">
+          <wp:anchor distT="0" distB="0" distL="114300" distR="114300" simplePos="0" relativeHeight="251670528" behindDoc="0" locked="0" layoutInCell="1" allowOverlap="1" wp14:anchorId="293D0D80" wp14:editId="263BBB32">
             <wp:simplePos x="0" y="0"/>
             <wp:positionH relativeFrom="margin">
               <wp:align>center</wp:align>
@@ -4795,7 +4720,6 @@
     <w:p/>
     <w:p/>
     <w:p>
-      <w:bookmarkStart w:id="0" w:name="_GoBack"/>
       <w:r>
         <w:t xml:space="preserve">Overall, Whisper performed </w:t>
       </w:r>
@@ -4826,8 +4750,9 @@
       <w:r>
         <w:t>.</w:t>
       </w:r>
-      <w:bookmarkEnd w:id="0"/>
     </w:p>
+    <w:bookmarkEnd w:id="0"/>
+    <w:p/>
     <w:sectPr>
       <w:headerReference w:type="default" r:id="rId17"/>
       <w:pgSz w:w="12240" w:h="15840"/>
@@ -6296,6 +6221,7 @@
   <w:style w:type="character" w:default="1" w:styleId="DefaultParagraphFont">
     <w:name w:val="Default Paragraph Font"/>
     <w:uiPriority w:val="1"/>
+    <w:semiHidden/>
     <w:unhideWhenUsed/>
   </w:style>
   <w:style w:type="table" w:default="1" w:styleId="TableNormal">
@@ -6931,7 +6857,7 @@
           </c:val>
           <c:extLst>
             <c:ext xmlns:c16="http://schemas.microsoft.com/office/drawing/2014/chart" uri="{C3380CC4-5D6E-409C-BE32-E72D297353CC}">
-              <c16:uniqueId val="{00000000-D78C-4DBB-862B-90155185CF15}"/>
+              <c16:uniqueId val="{00000000-D41A-4399-9F4A-C6CD33A69EE0}"/>
             </c:ext>
           </c:extLst>
         </c:ser>
@@ -7014,7 +6940,7 @@
           </c:val>
           <c:extLst>
             <c:ext xmlns:c16="http://schemas.microsoft.com/office/drawing/2014/chart" uri="{C3380CC4-5D6E-409C-BE32-E72D297353CC}">
-              <c16:uniqueId val="{00000001-D78C-4DBB-862B-90155185CF15}"/>
+              <c16:uniqueId val="{00000001-D41A-4399-9F4A-C6CD33A69EE0}"/>
             </c:ext>
           </c:extLst>
         </c:ser>
@@ -7097,7 +7023,7 @@
           </c:val>
           <c:extLst>
             <c:ext xmlns:c16="http://schemas.microsoft.com/office/drawing/2014/chart" uri="{C3380CC4-5D6E-409C-BE32-E72D297353CC}">
-              <c16:uniqueId val="{00000002-D78C-4DBB-862B-90155185CF15}"/>
+              <c16:uniqueId val="{00000002-D41A-4399-9F4A-C6CD33A69EE0}"/>
             </c:ext>
           </c:extLst>
         </c:ser>
@@ -7180,7 +7106,7 @@
           </c:val>
           <c:extLst>
             <c:ext xmlns:c16="http://schemas.microsoft.com/office/drawing/2014/chart" uri="{C3380CC4-5D6E-409C-BE32-E72D297353CC}">
-              <c16:uniqueId val="{00000003-D78C-4DBB-862B-90155185CF15}"/>
+              <c16:uniqueId val="{00000003-D41A-4399-9F4A-C6CD33A69EE0}"/>
             </c:ext>
           </c:extLst>
         </c:ser>
@@ -7263,7 +7189,7 @@
           </c:val>
           <c:extLst>
             <c:ext xmlns:c16="http://schemas.microsoft.com/office/drawing/2014/chart" uri="{C3380CC4-5D6E-409C-BE32-E72D297353CC}">
-              <c16:uniqueId val="{00000004-D78C-4DBB-862B-90155185CF15}"/>
+              <c16:uniqueId val="{00000004-D41A-4399-9F4A-C6CD33A69EE0}"/>
             </c:ext>
           </c:extLst>
         </c:ser>
@@ -7646,7 +7572,7 @@
           </c:val>
           <c:extLst>
             <c:ext xmlns:c16="http://schemas.microsoft.com/office/drawing/2014/chart" uri="{C3380CC4-5D6E-409C-BE32-E72D297353CC}">
-              <c16:uniqueId val="{00000000-CA77-4464-88C7-72FA3EF66A32}"/>
+              <c16:uniqueId val="{00000000-7DCD-4576-92A1-114A826955F9}"/>
             </c:ext>
           </c:extLst>
         </c:ser>
@@ -7729,7 +7655,7 @@
           </c:val>
           <c:extLst>
             <c:ext xmlns:c16="http://schemas.microsoft.com/office/drawing/2014/chart" uri="{C3380CC4-5D6E-409C-BE32-E72D297353CC}">
-              <c16:uniqueId val="{00000001-CA77-4464-88C7-72FA3EF66A32}"/>
+              <c16:uniqueId val="{00000001-7DCD-4576-92A1-114A826955F9}"/>
             </c:ext>
           </c:extLst>
         </c:ser>
@@ -7812,7 +7738,7 @@
           </c:val>
           <c:extLst>
             <c:ext xmlns:c16="http://schemas.microsoft.com/office/drawing/2014/chart" uri="{C3380CC4-5D6E-409C-BE32-E72D297353CC}">
-              <c16:uniqueId val="{00000002-CA77-4464-88C7-72FA3EF66A32}"/>
+              <c16:uniqueId val="{00000002-7DCD-4576-92A1-114A826955F9}"/>
             </c:ext>
           </c:extLst>
         </c:ser>
@@ -7895,7 +7821,7 @@
           </c:val>
           <c:extLst>
             <c:ext xmlns:c16="http://schemas.microsoft.com/office/drawing/2014/chart" uri="{C3380CC4-5D6E-409C-BE32-E72D297353CC}">
-              <c16:uniqueId val="{00000003-CA77-4464-88C7-72FA3EF66A32}"/>
+              <c16:uniqueId val="{00000003-7DCD-4576-92A1-114A826955F9}"/>
             </c:ext>
           </c:extLst>
         </c:ser>
@@ -7978,7 +7904,7 @@
           </c:val>
           <c:extLst>
             <c:ext xmlns:c16="http://schemas.microsoft.com/office/drawing/2014/chart" uri="{C3380CC4-5D6E-409C-BE32-E72D297353CC}">
-              <c16:uniqueId val="{00000004-CA77-4464-88C7-72FA3EF66A32}"/>
+              <c16:uniqueId val="{00000004-7DCD-4576-92A1-114A826955F9}"/>
             </c:ext>
           </c:extLst>
         </c:ser>
@@ -8314,7 +8240,7 @@
           </c:val>
           <c:extLst>
             <c:ext xmlns:c16="http://schemas.microsoft.com/office/drawing/2014/chart" uri="{C3380CC4-5D6E-409C-BE32-E72D297353CC}">
-              <c16:uniqueId val="{00000000-71B9-4471-83EA-9B3100042710}"/>
+              <c16:uniqueId val="{00000000-4C50-4DCF-B15D-AA1A459A289B}"/>
             </c:ext>
           </c:extLst>
         </c:ser>
@@ -8379,7 +8305,7 @@
           </c:val>
           <c:extLst>
             <c:ext xmlns:c16="http://schemas.microsoft.com/office/drawing/2014/chart" uri="{C3380CC4-5D6E-409C-BE32-E72D297353CC}">
-              <c16:uniqueId val="{00000001-71B9-4471-83EA-9B3100042710}"/>
+              <c16:uniqueId val="{00000001-4C50-4DCF-B15D-AA1A459A289B}"/>
             </c:ext>
           </c:extLst>
         </c:ser>
@@ -8734,7 +8660,7 @@
           </c:val>
           <c:extLst>
             <c:ext xmlns:c16="http://schemas.microsoft.com/office/drawing/2014/chart" uri="{C3380CC4-5D6E-409C-BE32-E72D297353CC}">
-              <c16:uniqueId val="{00000000-2973-441B-BDCA-B37A0D4750B3}"/>
+              <c16:uniqueId val="{00000000-499A-4E13-82D2-202470DE5CEA}"/>
             </c:ext>
           </c:extLst>
         </c:ser>
@@ -8817,7 +8743,7 @@
           </c:val>
           <c:extLst>
             <c:ext xmlns:c16="http://schemas.microsoft.com/office/drawing/2014/chart" uri="{C3380CC4-5D6E-409C-BE32-E72D297353CC}">
-              <c16:uniqueId val="{00000001-2973-441B-BDCA-B37A0D4750B3}"/>
+              <c16:uniqueId val="{00000001-499A-4E13-82D2-202470DE5CEA}"/>
             </c:ext>
           </c:extLst>
         </c:ser>
@@ -8900,7 +8826,7 @@
           </c:val>
           <c:extLst>
             <c:ext xmlns:c16="http://schemas.microsoft.com/office/drawing/2014/chart" uri="{C3380CC4-5D6E-409C-BE32-E72D297353CC}">
-              <c16:uniqueId val="{00000002-2973-441B-BDCA-B37A0D4750B3}"/>
+              <c16:uniqueId val="{00000002-499A-4E13-82D2-202470DE5CEA}"/>
             </c:ext>
           </c:extLst>
         </c:ser>
@@ -8983,7 +8909,7 @@
           </c:val>
           <c:extLst>
             <c:ext xmlns:c16="http://schemas.microsoft.com/office/drawing/2014/chart" uri="{C3380CC4-5D6E-409C-BE32-E72D297353CC}">
-              <c16:uniqueId val="{00000003-2973-441B-BDCA-B37A0D4750B3}"/>
+              <c16:uniqueId val="{00000003-499A-4E13-82D2-202470DE5CEA}"/>
             </c:ext>
           </c:extLst>
         </c:ser>
@@ -9066,7 +8992,7 @@
           </c:val>
           <c:extLst>
             <c:ext xmlns:c16="http://schemas.microsoft.com/office/drawing/2014/chart" uri="{C3380CC4-5D6E-409C-BE32-E72D297353CC}">
-              <c16:uniqueId val="{00000004-2973-441B-BDCA-B37A0D4750B3}"/>
+              <c16:uniqueId val="{00000004-499A-4E13-82D2-202470DE5CEA}"/>
             </c:ext>
           </c:extLst>
         </c:ser>
@@ -9412,7 +9338,7 @@
           </c:val>
           <c:extLst>
             <c:ext xmlns:c16="http://schemas.microsoft.com/office/drawing/2014/chart" uri="{C3380CC4-5D6E-409C-BE32-E72D297353CC}">
-              <c16:uniqueId val="{00000000-2241-4671-9724-35930291664D}"/>
+              <c16:uniqueId val="{00000000-83EC-4EEB-9174-BED38BE1EB21}"/>
             </c:ext>
           </c:extLst>
         </c:ser>
@@ -12597,7 +12523,7 @@
 </file>
 
 <file path=customXml/itemProps1.xml><?xml version="1.0" encoding="utf-8"?>
-<ds:datastoreItem xmlns:ds="http://schemas.openxmlformats.org/officeDocument/2006/customXml" ds:itemID="{7371BC6B-06B4-48B5-B16F-34D2572F250A}">
+<ds:datastoreItem xmlns:ds="http://schemas.openxmlformats.org/officeDocument/2006/customXml" ds:itemID="{0BCA4ECB-CC39-43B9-B929-7BDDC7417523}">
   <ds:schemaRefs>
     <ds:schemaRef ds:uri="http://schemas.openxmlformats.org/officeDocument/2006/bibliography"/>
   </ds:schemaRefs>

</xml_diff>